<commit_message>
Fix Excel read/write sheet mismatch on multi-sheet workbooks
Import-Excel without -WorksheetName reads the first sheet by position,
but Export-Excel without -WorksheetName defaults to a sheet literally
named "Sheet1" - on a workbook whose first sheet has a different name,
the write-back could land in a stray new sheet or clobber an unrelated
existing "Sheet1" tab. Now the worksheet name is resolved once via
Get-ExcelSheetInfo and reused for both the read and the write-back.
Documented in the runbook (new §7.5) with a recommendation to always
pass -WorksheetName explicitly on multi-sheet workbooks.

Co-Authored-By: Claude Sonnet 5 <noreply@anthropic.com>
</commit_message>
<xml_diff>
--- a/FileShareCleanup-Governed/Runbook.docx
+++ b/FileShareCleanup-Governed/Runbook.docx
@@ -1943,7 +1943,7 @@
       </w:r>
     </w:p>
     <w:bookmarkEnd w:id="27"/>
-    <w:bookmarkStart w:id="32" w:name="X34b86626be4f464a2273ee729b28474f1b61730"/>
+    <w:bookmarkStart w:id="33" w:name="X34b86626be4f464a2273ee729b28474f1b61730"/>
     <w:p>
       <w:pPr>
         <w:pStyle w:val="Heading1"/>
@@ -2692,8 +2692,321 @@
       </w:r>
     </w:p>
     <w:bookmarkEnd w:id="31"/>
+    <w:bookmarkStart w:id="32" w:name="if-the-excel-file-has-multiple-sheets"/>
+    <w:p>
+      <w:pPr>
+        <w:pStyle w:val="Heading2"/>
+      </w:pPr>
+      <w:r>
+        <w:t xml:space="preserve">7.5 If the Excel file has multiple sheets</w:t>
+      </w:r>
+    </w:p>
+    <w:p>
+      <w:pPr>
+        <w:pStyle w:val="FirstParagraph"/>
+      </w:pPr>
+      <w:r>
+        <w:t xml:space="preserve">Without</w:t>
+      </w:r>
+      <w:r>
+        <w:t xml:space="preserve"> </w:t>
+      </w:r>
+      <w:r>
+        <w:rPr>
+          <w:rStyle w:val="VerbatimChar"/>
+        </w:rPr>
+        <w:t xml:space="preserve">-WorksheetName</w:t>
+      </w:r>
+      <w:r>
+        <w:t xml:space="preserve">, the script reads whichever sheet is</w:t>
+      </w:r>
+      <w:r>
+        <w:t xml:space="preserve"> </w:t>
+      </w:r>
+      <w:r>
+        <w:rPr>
+          <w:b/>
+          <w:bCs/>
+        </w:rPr>
+        <w:t xml:space="preserve">first by</w:t>
+      </w:r>
+      <w:r>
+        <w:rPr>
+          <w:b/>
+          <w:bCs/>
+        </w:rPr>
+        <w:t xml:space="preserve"> </w:t>
+      </w:r>
+      <w:r>
+        <w:rPr>
+          <w:b/>
+          <w:bCs/>
+        </w:rPr>
+        <w:t xml:space="preserve">position</w:t>
+      </w:r>
+      <w:r>
+        <w:t xml:space="preserve"> </w:t>
+      </w:r>
+      <w:r>
+        <w:t xml:space="preserve">in the workbook, and writes the results back into that exact</w:t>
+      </w:r>
+      <w:r>
+        <w:t xml:space="preserve"> </w:t>
+      </w:r>
+      <w:r>
+        <w:t xml:space="preserve">same sheet — it resolves the sheet name once at the start of the run and</w:t>
+      </w:r>
+      <w:r>
+        <w:t xml:space="preserve"> </w:t>
+      </w:r>
+      <w:r>
+        <w:t xml:space="preserve">reuses it, so read and write can never end up targeting two different</w:t>
+      </w:r>
+      <w:r>
+        <w:t xml:space="preserve"> </w:t>
+      </w:r>
+      <w:r>
+        <w:t xml:space="preserve">sheets even if the first sheet isn’t named</w:t>
+      </w:r>
+      <w:r>
+        <w:t xml:space="preserve"> </w:t>
+      </w:r>
+      <w:r>
+        <w:rPr>
+          <w:rStyle w:val="VerbatimChar"/>
+        </w:rPr>
+        <w:t xml:space="preserve">Sheet1</w:t>
+      </w:r>
+      <w:r>
+        <w:t xml:space="preserve">.</w:t>
+      </w:r>
+    </w:p>
+    <w:p>
+      <w:pPr>
+        <w:pStyle w:val="BodyText"/>
+      </w:pPr>
+      <w:r>
+        <w:t xml:space="preserve">Still, if your workbook has more than one sheet,</w:t>
+      </w:r>
+      <w:r>
+        <w:t xml:space="preserve"> </w:t>
+      </w:r>
+      <w:r>
+        <w:rPr>
+          <w:b/>
+          <w:bCs/>
+        </w:rPr>
+        <w:t xml:space="preserve">pass</w:t>
+      </w:r>
+      <w:r>
+        <w:rPr>
+          <w:b/>
+          <w:bCs/>
+        </w:rPr>
+        <w:t xml:space="preserve"> </w:t>
+      </w:r>
+      <w:r>
+        <w:rPr>
+          <w:rStyle w:val="VerbatimChar"/>
+          <w:b/>
+          <w:bCs/>
+        </w:rPr>
+        <w:t xml:space="preserve">-WorksheetName</w:t>
+      </w:r>
+      <w:r>
+        <w:rPr>
+          <w:b/>
+          <w:bCs/>
+        </w:rPr>
+        <w:t xml:space="preserve"> </w:t>
+      </w:r>
+      <w:r>
+        <w:rPr>
+          <w:b/>
+          <w:bCs/>
+        </w:rPr>
+        <w:t xml:space="preserve">explicitly</w:t>
+      </w:r>
+      <w:r>
+        <w:t xml:space="preserve"> </w:t>
+      </w:r>
+      <w:r>
+        <w:t xml:space="preserve">naming the one with your candidate list. It removes any</w:t>
+      </w:r>
+      <w:r>
+        <w:t xml:space="preserve"> </w:t>
+      </w:r>
+      <w:r>
+        <w:t xml:space="preserve">ambiguity about which sheet is</w:t>
+      </w:r>
+      <w:r>
+        <w:t xml:space="preserve"> </w:t>
+      </w:r>
+      <w:r>
+        <w:t xml:space="preserve">“first,”</w:t>
+      </w:r>
+      <w:r>
+        <w:t xml:space="preserve"> </w:t>
+      </w:r>
+      <w:r>
+        <w:t xml:space="preserve">and it’s the only way to point the</w:t>
+      </w:r>
+      <w:r>
+        <w:t xml:space="preserve"> </w:t>
+      </w:r>
+      <w:r>
+        <w:t xml:space="preserve">script at a sheet that isn’t the first one:</w:t>
+      </w:r>
+    </w:p>
+    <w:p>
+      <w:pPr>
+        <w:pStyle w:val="SourceCode"/>
+      </w:pPr>
+      <w:r>
+        <w:rPr>
+          <w:rStyle w:val="OperatorTok"/>
+        </w:rPr>
+        <w:t xml:space="preserve">.</w:t>
+      </w:r>
+      <w:r>
+        <w:rPr>
+          <w:rStyle w:val="NormalTok"/>
+        </w:rPr>
+        <w:t xml:space="preserve">\Invoke-GovernedDeletionFromExcel</w:t>
+      </w:r>
+      <w:r>
+        <w:rPr>
+          <w:rStyle w:val="OperatorTok"/>
+        </w:rPr>
+        <w:t xml:space="preserve">.</w:t>
+      </w:r>
+      <w:r>
+        <w:rPr>
+          <w:rStyle w:val="FunctionTok"/>
+        </w:rPr>
+        <w:t xml:space="preserve">ps1</w:t>
+      </w:r>
+      <w:r>
+        <w:rPr>
+          <w:rStyle w:val="NormalTok"/>
+        </w:rPr>
+        <w:t xml:space="preserve"> </w:t>
+      </w:r>
+      <w:r>
+        <w:rPr>
+          <w:rStyle w:val="OperatorTok"/>
+        </w:rPr>
+        <w:t xml:space="preserve">-</w:t>
+      </w:r>
+      <w:r>
+        <w:rPr>
+          <w:rStyle w:val="NormalTok"/>
+        </w:rPr>
+        <w:t xml:space="preserve">ExcelPath </w:t>
+      </w:r>
+      <w:r>
+        <w:rPr>
+          <w:rStyle w:val="StringTok"/>
+        </w:rPr>
+        <w:t xml:space="preserve">".\export.xlsx"</w:t>
+      </w:r>
+      <w:r>
+        <w:rPr>
+          <w:rStyle w:val="NormalTok"/>
+        </w:rPr>
+        <w:t xml:space="preserve"> </w:t>
+      </w:r>
+      <w:r>
+        <w:rPr>
+          <w:rStyle w:val="OperatorTok"/>
+        </w:rPr>
+        <w:t xml:space="preserve">-</w:t>
+      </w:r>
+      <w:r>
+        <w:rPr>
+          <w:rStyle w:val="NormalTok"/>
+        </w:rPr>
+        <w:t xml:space="preserve">WorksheetName </w:t>
+      </w:r>
+      <w:r>
+        <w:rPr>
+          <w:rStyle w:val="StringTok"/>
+        </w:rPr>
+        <w:t xml:space="preserve">"Candidates"</w:t>
+      </w:r>
+      <w:r>
+        <w:rPr>
+          <w:rStyle w:val="NormalTok"/>
+        </w:rPr>
+        <w:t xml:space="preserve"> `</w:t>
+      </w:r>
+      <w:r>
+        <w:br/>
+      </w:r>
+      <w:r>
+        <w:rPr>
+          <w:rStyle w:val="NormalTok"/>
+        </w:rPr>
+        <w:t xml:space="preserve">    </w:t>
+      </w:r>
+      <w:r>
+        <w:rPr>
+          <w:rStyle w:val="OperatorTok"/>
+        </w:rPr>
+        <w:t xml:space="preserve">-</w:t>
+      </w:r>
+      <w:r>
+        <w:rPr>
+          <w:rStyle w:val="NormalTok"/>
+        </w:rPr>
+        <w:t xml:space="preserve">TargetDrive </w:t>
+      </w:r>
+      <w:r>
+        <w:rPr>
+          <w:rStyle w:val="StringTok"/>
+        </w:rPr>
+        <w:t xml:space="preserve">"\\FS01\Projects"</w:t>
+      </w:r>
+      <w:r>
+        <w:rPr>
+          <w:rStyle w:val="NormalTok"/>
+        </w:rPr>
+        <w:t xml:space="preserve"> </w:t>
+      </w:r>
+      <w:r>
+        <w:rPr>
+          <w:rStyle w:val="OperatorTok"/>
+        </w:rPr>
+        <w:t xml:space="preserve">-</w:t>
+      </w:r>
+      <w:r>
+        <w:rPr>
+          <w:rStyle w:val="NormalTok"/>
+        </w:rPr>
+        <w:t xml:space="preserve">ActivityType Quarantine </w:t>
+      </w:r>
+      <w:r>
+        <w:rPr>
+          <w:rStyle w:val="OperatorTok"/>
+        </w:rPr>
+        <w:t xml:space="preserve">-</w:t>
+      </w:r>
+      <w:r>
+        <w:rPr>
+          <w:rStyle w:val="NormalTok"/>
+        </w:rPr>
+        <w:t xml:space="preserve">QuarantineRoot </w:t>
+      </w:r>
+      <w:r>
+        <w:rPr>
+          <w:rStyle w:val="StringTok"/>
+        </w:rPr>
+        <w:t xml:space="preserve">"\\FS01\_Quarantine"</w:t>
+      </w:r>
+    </w:p>
     <w:bookmarkEnd w:id="32"/>
-    <w:bookmarkStart w:id="33" w:name="testing-before-a-real-run"/>
+    <w:bookmarkEnd w:id="33"/>
+    <w:bookmarkStart w:id="34" w:name="testing-before-a-real-run"/>
     <w:p>
       <w:pPr>
         <w:pStyle w:val="Heading1"/>
@@ -2782,8 +3095,8 @@
         <w:t xml:space="preserve">folder structure correctly.</w:t>
       </w:r>
     </w:p>
-    <w:bookmarkEnd w:id="33"/>
-    <w:bookmarkStart w:id="34" w:name="X1a6a46a0f049bfe7fe860351c730c75f0923619"/>
+    <w:bookmarkEnd w:id="34"/>
+    <w:bookmarkStart w:id="35" w:name="X1a6a46a0f049bfe7fe860351c730c75f0923619"/>
     <w:p>
       <w:pPr>
         <w:pStyle w:val="Heading1"/>
@@ -3060,8 +3373,8 @@
         <w:t xml:space="preserve">validated against your actual retention requirement.</w:t>
       </w:r>
     </w:p>
-    <w:bookmarkEnd w:id="34"/>
-    <w:bookmarkStart w:id="35" w:name="X9c6ad848db1408be413aba9c5c4dcacf23f1681"/>
+    <w:bookmarkEnd w:id="35"/>
+    <w:bookmarkStart w:id="36" w:name="X9c6ad848db1408be413aba9c5c4dcacf23f1681"/>
     <w:p>
       <w:pPr>
         <w:pStyle w:val="Heading1"/>
@@ -3226,8 +3539,8 @@
         <w:t xml:space="preserve">until that’s settled.</w:t>
       </w:r>
     </w:p>
-    <w:bookmarkEnd w:id="35"/>
-    <w:bookmarkStart w:id="36" w:name="troubleshooting"/>
+    <w:bookmarkEnd w:id="36"/>
+    <w:bookmarkStart w:id="37" w:name="troubleshooting"/>
     <w:p>
       <w:pPr>
         <w:pStyle w:val="Heading1"/>
@@ -3489,6 +3802,45 @@
               <w:pStyle w:val="Compact"/>
             </w:pPr>
             <w:r>
+              <w:t xml:space="preserve">Excel workbook has multiple sheets and you’re not sure which one got read/updated</w:t>
+            </w:r>
+          </w:p>
+        </w:tc>
+        <w:tc>
+          <w:tcPr/>
+          <w:p>
+            <w:pPr>
+              <w:pStyle w:val="Compact"/>
+            </w:pPr>
+            <w:r>
+              <w:t xml:space="preserve">Always pass</w:t>
+            </w:r>
+            <w:r>
+              <w:t xml:space="preserve"> </w:t>
+            </w:r>
+            <w:r>
+              <w:rPr>
+                <w:rStyle w:val="VerbatimChar"/>
+              </w:rPr>
+              <w:t xml:space="preserve">-WorksheetName</w:t>
+            </w:r>
+            <w:r>
+              <w:t xml:space="preserve"> </w:t>
+            </w:r>
+            <w:r>
+              <w:t xml:space="preserve">explicitly on a multi-sheet workbook — see §7.5.</w:t>
+            </w:r>
+          </w:p>
+        </w:tc>
+      </w:tr>
+      <w:tr>
+        <w:tc>
+          <w:tcPr/>
+          <w:p>
+            <w:pPr>
+              <w:pStyle w:val="Compact"/>
+            </w:pPr>
+            <w:r>
               <w:t xml:space="preserve">Confirmation prompt won’t accept my answer</w:t>
             </w:r>
           </w:p>
@@ -3530,8 +3882,8 @@
         </w:tc>
       </w:tr>
     </w:tbl>
-    <w:bookmarkEnd w:id="36"/>
-    <w:bookmarkStart w:id="40" w:name="parameter-reference"/>
+    <w:bookmarkEnd w:id="37"/>
+    <w:bookmarkStart w:id="41" w:name="parameter-reference"/>
     <w:p>
       <w:pPr>
         <w:pStyle w:val="Heading1"/>
@@ -3540,7 +3892,7 @@
         <w:t xml:space="preserve">12. Parameter reference</w:t>
       </w:r>
     </w:p>
-    <w:bookmarkStart w:id="37" w:name="find-governedcandidatesbyscan.ps1"/>
+    <w:bookmarkStart w:id="38" w:name="find-governedcandidatesbyscan.ps1"/>
     <w:p>
       <w:pPr>
         <w:pStyle w:val="Heading2"/>
@@ -4034,8 +4386,8 @@
         </w:tc>
       </w:tr>
     </w:tbl>
-    <w:bookmarkEnd w:id="37"/>
-    <w:bookmarkStart w:id="38" w:name="invoke-governeddeletionfromexcel.ps1"/>
+    <w:bookmarkEnd w:id="38"/>
+    <w:bookmarkStart w:id="39" w:name="invoke-governeddeletionfromexcel.ps1"/>
     <w:p>
       <w:pPr>
         <w:pStyle w:val="Heading2"/>
@@ -4442,6 +4794,24 @@
             <w:pPr>
               <w:pStyle w:val="Compact"/>
             </w:pPr>
+            <w:r>
+              <w:t xml:space="preserve">Set</w:t>
+            </w:r>
+            <w:r>
+              <w:t xml:space="preserve"> </w:t>
+            </w:r>
+            <w:r>
+              <w:rPr>
+                <w:rStyle w:val="VerbatimChar"/>
+              </w:rPr>
+              <w:t xml:space="preserve">-WorksheetName</w:t>
+            </w:r>
+            <w:r>
+              <w:t xml:space="preserve"> </w:t>
+            </w:r>
+            <w:r>
+              <w:t xml:space="preserve">explicitly on any multi-sheet workbook — see §7.5</w:t>
+            </w:r>
           </w:p>
         </w:tc>
       </w:tr>
@@ -4580,8 +4950,8 @@
         </w:tc>
       </w:tr>
     </w:tbl>
-    <w:bookmarkEnd w:id="38"/>
-    <w:bookmarkStart w:id="39" w:name="remove-expiredquarantine.ps1"/>
+    <w:bookmarkEnd w:id="39"/>
+    <w:bookmarkStart w:id="40" w:name="remove-expiredquarantine.ps1"/>
     <w:p>
       <w:pPr>
         <w:pStyle w:val="Heading2"/>
@@ -4848,8 +5218,8 @@
         </w:tc>
       </w:tr>
     </w:tbl>
-    <w:bookmarkEnd w:id="39"/>
     <w:bookmarkEnd w:id="40"/>
+    <w:bookmarkEnd w:id="41"/>
     <w:sectPr/>
   </w:body>
 </w:document>

</xml_diff>

<commit_message>
Make -TargetDrive optional instead of a blocking prompt
The Excel-driven script was prompting (Read-Host) for -TargetDrive when
omitted, which silently blocks with no error or log output in unattended
or output-redirected runs - exactly the "stuck at Phase 1/3" symptom
reported. Every candidate row already carries its own full path, so
there's nothing to ask up front: -TargetDrive is now a fully optional
safety-net scope filter, and quarantine anchors each item's relative path
to its own UNC share/drive root (Get-GovernedPathRoot) when it's not
given. The only remaining prompt is -ActivityType, which can't be
inferred from the Excel data. Runbook updated accordingly, plus a new
troubleshooting entry for the "stuck with no errors" symptom.

Co-Authored-By: Claude Sonnet 5 <noreply@anthropic.com>
</commit_message>
<xml_diff>
--- a/FileShareCleanup-Governed/Runbook.docx
+++ b/FileShareCleanup-Governed/Runbook.docx
@@ -983,7 +983,7 @@
               <w:pStyle w:val="Compact"/>
             </w:pPr>
             <w:r>
-              <w:t xml:space="preserve">Prompted interactively if you don’t pass it</w:t>
+              <w:t xml:space="preserve">Prompted interactively if you don’t pass it — this is the only prompt</w:t>
             </w:r>
           </w:p>
         </w:tc>
@@ -1064,6 +1064,78 @@
         <w:pStyle w:val="BodyText"/>
       </w:pPr>
       <w:r>
+        <w:t xml:space="preserve">Note what’s</w:t>
+      </w:r>
+      <w:r>
+        <w:t xml:space="preserve"> </w:t>
+      </w:r>
+      <w:r>
+        <w:rPr>
+          <w:b/>
+          <w:bCs/>
+        </w:rPr>
+        <w:t xml:space="preserve">not</w:t>
+      </w:r>
+      <w:r>
+        <w:t xml:space="preserve"> </w:t>
+      </w:r>
+      <w:r>
+        <w:t xml:space="preserve">in this table:</w:t>
+      </w:r>
+      <w:r>
+        <w:t xml:space="preserve"> </w:t>
+      </w:r>
+      <w:r>
+        <w:rPr>
+          <w:rStyle w:val="VerbatimChar"/>
+        </w:rPr>
+        <w:t xml:space="preserve">-TargetDrive</w:t>
+      </w:r>
+      <w:r>
+        <w:t xml:space="preserve"> </w:t>
+      </w:r>
+      <w:r>
+        <w:t xml:space="preserve">on</w:t>
+      </w:r>
+      <w:r>
+        <w:t xml:space="preserve"> </w:t>
+      </w:r>
+      <w:r>
+        <w:rPr>
+          <w:rStyle w:val="VerbatimChar"/>
+        </w:rPr>
+        <w:t xml:space="preserve">Invoke-GovernedDeletionFromExcel.ps1</w:t>
+      </w:r>
+      <w:r>
+        <w:t xml:space="preserve"> </w:t>
+      </w:r>
+      <w:r>
+        <w:t xml:space="preserve">is optional and is never prompted for — every Excel row already carries its own full path,</w:t>
+      </w:r>
+      <w:r>
+        <w:t xml:space="preserve"> </w:t>
+      </w:r>
+      <w:r>
+        <w:t xml:space="preserve">so there’s nothing to ask up front. Passing it just adds an extra safety-net scope check</w:t>
+      </w:r>
+      <w:r>
+        <w:t xml:space="preserve"> </w:t>
+      </w:r>
+      <w:r>
+        <w:t xml:space="preserve">and gives quarantine a single common root to anchor relative paths to; omitting it means</w:t>
+      </w:r>
+      <w:r>
+        <w:t xml:space="preserve"> </w:t>
+      </w:r>
+      <w:r>
+        <w:t xml:space="preserve">each item quarantines relative to its own share/drive root instead. See §7.1.</w:t>
+      </w:r>
+    </w:p>
+    <w:p>
+      <w:pPr>
+        <w:pStyle w:val="BodyText"/>
+      </w:pPr>
+      <w:r>
         <w:rPr>
           <w:b/>
           <w:bCs/>
@@ -1857,7 +1929,7 @@
         <w:t xml:space="preserve"> </w:t>
       </w:r>
       <w:r>
-        <w:t xml:space="preserve">you gave it as the</w:t>
+        <w:t xml:space="preserve">you gave it as the (optional)</w:t>
       </w:r>
       <w:r>
         <w:t xml:space="preserve"> </w:t>
@@ -1872,19 +1944,13 @@
         <w:t xml:space="preserve"> </w:t>
       </w:r>
       <w:r>
-        <w:t xml:space="preserve">for step 6 — copy that line</w:t>
-      </w:r>
-      <w:r>
-        <w:t xml:space="preserve"> </w:t>
-      </w:r>
-      <w:r>
-        <w:t xml:space="preserve">rather than retyping it, to avoid a typo causing rows to be skipped as</w:t>
-      </w:r>
-      <w:r>
-        <w:t xml:space="preserve"> </w:t>
-      </w:r>
-      <w:r>
-        <w:t xml:space="preserve">out-of-scope.</w:t>
+        <w:t xml:space="preserve">for step 6 — copy</w:t>
+      </w:r>
+      <w:r>
+        <w:t xml:space="preserve"> </w:t>
+      </w:r>
+      <w:r>
+        <w:t xml:space="preserve">that line rather than retyping it if you want that extra scope check.</w:t>
       </w:r>
     </w:p>
     <w:bookmarkEnd w:id="25"/>
@@ -2064,72 +2130,188 @@
         <w:rPr>
           <w:rStyle w:val="NormalTok"/>
         </w:rPr>
-        <w:t xml:space="preserve">TargetDrive </w:t>
+        <w:t xml:space="preserve">ActivityType Quarantine `</w:t>
+      </w:r>
+      <w:r>
+        <w:br/>
+      </w:r>
+      <w:r>
+        <w:rPr>
+          <w:rStyle w:val="NormalTok"/>
+        </w:rPr>
+        <w:t xml:space="preserve">    </w:t>
+      </w:r>
+      <w:r>
+        <w:rPr>
+          <w:rStyle w:val="OperatorTok"/>
+        </w:rPr>
+        <w:t xml:space="preserve">-</w:t>
+      </w:r>
+      <w:r>
+        <w:rPr>
+          <w:rStyle w:val="NormalTok"/>
+        </w:rPr>
+        <w:t xml:space="preserve">QuarantineRoot </w:t>
       </w:r>
       <w:r>
         <w:rPr>
           <w:rStyle w:val="StringTok"/>
         </w:rPr>
-        <w:t xml:space="preserve">"\\FS01\Projects"</w:t>
-      </w:r>
-      <w:r>
-        <w:rPr>
-          <w:rStyle w:val="NormalTok"/>
-        </w:rPr>
-        <w:t xml:space="preserve"> `</w:t>
-      </w:r>
-      <w:r>
-        <w:br/>
-      </w:r>
-      <w:r>
-        <w:rPr>
-          <w:rStyle w:val="NormalTok"/>
-        </w:rPr>
-        <w:t xml:space="preserve">    </w:t>
-      </w:r>
-      <w:r>
-        <w:rPr>
-          <w:rStyle w:val="OperatorTok"/>
-        </w:rPr>
-        <w:t xml:space="preserve">-</w:t>
-      </w:r>
-      <w:r>
-        <w:rPr>
-          <w:rStyle w:val="NormalTok"/>
-        </w:rPr>
-        <w:t xml:space="preserve">ActivityType Quarantine `</w:t>
-      </w:r>
-      <w:r>
-        <w:br/>
-      </w:r>
-      <w:r>
-        <w:rPr>
-          <w:rStyle w:val="NormalTok"/>
-        </w:rPr>
-        <w:t xml:space="preserve">    </w:t>
-      </w:r>
-      <w:r>
-        <w:rPr>
-          <w:rStyle w:val="OperatorTok"/>
-        </w:rPr>
-        <w:t xml:space="preserve">-</w:t>
-      </w:r>
-      <w:r>
-        <w:rPr>
-          <w:rStyle w:val="NormalTok"/>
-        </w:rPr>
-        <w:t xml:space="preserve">QuarantineRoot </w:t>
-      </w:r>
-      <w:r>
-        <w:rPr>
-          <w:rStyle w:val="StringTok"/>
-        </w:rPr>
         <w:t xml:space="preserve">"\\FS01\_Quarantine"</w:t>
       </w:r>
     </w:p>
     <w:p>
       <w:pPr>
         <w:pStyle w:val="FirstParagraph"/>
+      </w:pPr>
+      <w:r>
+        <w:rPr>
+          <w:rStyle w:val="VerbatimChar"/>
+        </w:rPr>
+        <w:t xml:space="preserve">-TargetDrive</w:t>
+      </w:r>
+      <w:r>
+        <w:t xml:space="preserve"> </w:t>
+      </w:r>
+      <w:r>
+        <w:t xml:space="preserve">is not required — each row’s own path is already in the Excel.</w:t>
+      </w:r>
+      <w:r>
+        <w:t xml:space="preserve"> </w:t>
+      </w:r>
+      <w:r>
+        <w:t xml:space="preserve">Add</w:t>
+      </w:r>
+      <w:r>
+        <w:t xml:space="preserve"> </w:t>
+      </w:r>
+      <w:r>
+        <w:rPr>
+          <w:rStyle w:val="VerbatimChar"/>
+        </w:rPr>
+        <w:t xml:space="preserve">-TargetDrive "\\FS01\Projects"</w:t>
+      </w:r>
+      <w:r>
+        <w:t xml:space="preserve"> </w:t>
+      </w:r>
+      <w:r>
+        <w:t xml:space="preserve">only if you want the extra safety net of</w:t>
+      </w:r>
+      <w:r>
+        <w:t xml:space="preserve"> </w:t>
+      </w:r>
+      <w:r>
+        <w:t xml:space="preserve">skipping any row that isn’t under that root, and a single common anchor for</w:t>
+      </w:r>
+      <w:r>
+        <w:t xml:space="preserve"> </w:t>
+      </w:r>
+      <w:r>
+        <w:t xml:space="preserve">quarantine’s relative paths instead of each item using its own share/drive</w:t>
+      </w:r>
+      <w:r>
+        <w:t xml:space="preserve"> </w:t>
+      </w:r>
+      <w:r>
+        <w:t xml:space="preserve">root.</w:t>
+      </w:r>
+    </w:p>
+    <w:p>
+      <w:pPr>
+        <w:pStyle w:val="BodyText"/>
+      </w:pPr>
+      <w:r>
+        <w:t xml:space="preserve">The</w:t>
+      </w:r>
+      <w:r>
+        <w:t xml:space="preserve"> </w:t>
+      </w:r>
+      <w:r>
+        <w:rPr>
+          <w:b/>
+          <w:bCs/>
+        </w:rPr>
+        <w:t xml:space="preserve">only</w:t>
+      </w:r>
+      <w:r>
+        <w:t xml:space="preserve"> </w:t>
+      </w:r>
+      <w:r>
+        <w:t xml:space="preserve">prompt you’ll see is for</w:t>
+      </w:r>
+      <w:r>
+        <w:t xml:space="preserve"> </w:t>
+      </w:r>
+      <w:r>
+        <w:rPr>
+          <w:rStyle w:val="VerbatimChar"/>
+        </w:rPr>
+        <w:t xml:space="preserve">-ActivityType</w:t>
+      </w:r>
+      <w:r>
+        <w:t xml:space="preserve">, since it wasn’t passed</w:t>
+      </w:r>
+      <w:r>
+        <w:t xml:space="preserve"> </w:t>
+      </w:r>
+      <w:r>
+        <w:t xml:space="preserve">above — type</w:t>
+      </w:r>
+      <w:r>
+        <w:t xml:space="preserve"> </w:t>
+      </w:r>
+      <w:r>
+        <w:rPr>
+          <w:rStyle w:val="VerbatimChar"/>
+        </w:rPr>
+        <w:t xml:space="preserve">Quarantine</w:t>
+      </w:r>
+      <w:r>
+        <w:t xml:space="preserve"> </w:t>
+      </w:r>
+      <w:r>
+        <w:t xml:space="preserve">or</w:t>
+      </w:r>
+      <w:r>
+        <w:t xml:space="preserve"> </w:t>
+      </w:r>
+      <w:r>
+        <w:rPr>
+          <w:rStyle w:val="VerbatimChar"/>
+        </w:rPr>
+        <w:t xml:space="preserve">Delete</w:t>
+      </w:r>
+      <w:r>
+        <w:t xml:space="preserve"> </w:t>
+      </w:r>
+      <w:r>
+        <w:t xml:space="preserve">when asked. If you passed</w:t>
+      </w:r>
+      <w:r>
+        <w:t xml:space="preserve"> </w:t>
+      </w:r>
+      <w:r>
+        <w:rPr>
+          <w:rStyle w:val="VerbatimChar"/>
+        </w:rPr>
+        <w:t xml:space="preserve">-ActivityType</w:t>
+      </w:r>
+      <w:r>
+        <w:t xml:space="preserve"> </w:t>
+      </w:r>
+      <w:r>
+        <w:t xml:space="preserve">already (as in this example), there’s no prompt at all — the run starts</w:t>
+      </w:r>
+      <w:r>
+        <w:t xml:space="preserve"> </w:t>
+      </w:r>
+      <w:r>
+        <w:t xml:space="preserve">immediately.</w:t>
+      </w:r>
+    </w:p>
+    <w:p>
+      <w:pPr>
+        <w:pStyle w:val="BodyText"/>
       </w:pPr>
       <w:r>
         <w:t xml:space="preserve">You’ll see, per row: a live colored console line (</w:t>
@@ -2332,39 +2514,6 @@
         <w:rPr>
           <w:rStyle w:val="NormalTok"/>
         </w:rPr>
-        <w:t xml:space="preserve">TargetDrive </w:t>
-      </w:r>
-      <w:r>
-        <w:rPr>
-          <w:rStyle w:val="StringTok"/>
-        </w:rPr>
-        <w:t xml:space="preserve">"\\FS01\Projects"</w:t>
-      </w:r>
-      <w:r>
-        <w:rPr>
-          <w:rStyle w:val="NormalTok"/>
-        </w:rPr>
-        <w:t xml:space="preserve"> `</w:t>
-      </w:r>
-      <w:r>
-        <w:br/>
-      </w:r>
-      <w:r>
-        <w:rPr>
-          <w:rStyle w:val="NormalTok"/>
-        </w:rPr>
-        <w:t xml:space="preserve">    </w:t>
-      </w:r>
-      <w:r>
-        <w:rPr>
-          <w:rStyle w:val="OperatorTok"/>
-        </w:rPr>
-        <w:t xml:space="preserve">-</w:t>
-      </w:r>
-      <w:r>
-        <w:rPr>
-          <w:rStyle w:val="NormalTok"/>
-        </w:rPr>
         <w:t xml:space="preserve">ActivityType Quarantine `</w:t>
       </w:r>
       <w:r>
@@ -2526,13 +2675,43 @@
         <w:t xml:space="preserve">-Execute</w:t>
       </w:r>
       <w:r>
-        <w:t xml:space="preserve">, you’ll be asked to type the</w:t>
-      </w:r>
-      <w:r>
-        <w:t xml:space="preserve"> </w:t>
-      </w:r>
-      <w:r>
-        <w:t xml:space="preserve">target drive back to confirm before anything is deleted.</w:t>
+        <w:t xml:space="preserve">, you’ll be asked to type a</w:t>
+      </w:r>
+      <w:r>
+        <w:t xml:space="preserve"> </w:t>
+      </w:r>
+      <w:r>
+        <w:t xml:space="preserve">confirmation phrase before anything is deleted: the target drive back, if</w:t>
+      </w:r>
+      <w:r>
+        <w:t xml:space="preserve"> </w:t>
+      </w:r>
+      <w:r>
+        <w:t xml:space="preserve">you passed</w:t>
+      </w:r>
+      <w:r>
+        <w:t xml:space="preserve"> </w:t>
+      </w:r>
+      <w:r>
+        <w:rPr>
+          <w:rStyle w:val="VerbatimChar"/>
+        </w:rPr>
+        <w:t xml:space="preserve">-TargetDrive</w:t>
+      </w:r>
+      <w:r>
+        <w:t xml:space="preserve">, otherwise the literal word</w:t>
+      </w:r>
+      <w:r>
+        <w:t xml:space="preserve"> </w:t>
+      </w:r>
+      <w:r>
+        <w:rPr>
+          <w:rStyle w:val="VerbatimChar"/>
+        </w:rPr>
+        <w:t xml:space="preserve">DELETE</w:t>
+      </w:r>
+      <w:r>
+        <w:t xml:space="preserve">.</w:t>
       </w:r>
     </w:p>
     <w:bookmarkEnd w:id="29"/>
@@ -3829,6 +4008,111 @@
             </w:r>
             <w:r>
               <w:t xml:space="preserve">explicitly on a multi-sheet workbook — see §7.5.</w:t>
+            </w:r>
+          </w:p>
+        </w:tc>
+      </w:tr>
+      <w:tr>
+        <w:tc>
+          <w:tcPr/>
+          <w:p>
+            <w:pPr>
+              <w:pStyle w:val="Compact"/>
+            </w:pPr>
+            <w:r>
+              <w:t xml:space="preserve">Console output stops right after</w:t>
+            </w:r>
+            <w:r>
+              <w:t xml:space="preserve"> </w:t>
+            </w:r>
+            <w:r>
+              <w:t xml:space="preserve">“Read N rows…”</w:t>
+            </w:r>
+            <w:r>
+              <w:t xml:space="preserve"> </w:t>
+            </w:r>
+            <w:r>
+              <w:t xml:space="preserve">with no errors and nothing new appearing</w:t>
+            </w:r>
+          </w:p>
+        </w:tc>
+        <w:tc>
+          <w:tcPr/>
+          <w:p>
+            <w:pPr>
+              <w:pStyle w:val="Compact"/>
+            </w:pPr>
+            <w:r>
+              <w:t xml:space="preserve">The script is waiting at the</w:t>
+            </w:r>
+            <w:r>
+              <w:t xml:space="preserve"> </w:t>
+            </w:r>
+            <w:r>
+              <w:rPr>
+                <w:rStyle w:val="VerbatimChar"/>
+              </w:rPr>
+              <w:t xml:space="preserve">-ActivityType</w:t>
+            </w:r>
+            <w:r>
+              <w:t xml:space="preserve"> </w:t>
+            </w:r>
+            <w:r>
+              <w:t xml:space="preserve">prompt — it’s the only prompt left in this script, and it’s easy to miss if you’re watching a redirected log file instead of the live console (the prompt goes to the console host, not to stdout). Look for</w:t>
+            </w:r>
+            <w:r>
+              <w:t xml:space="preserve"> </w:t>
+            </w:r>
+            <w:r>
+              <w:t xml:space="preserve">“Choose action for matched candidates…”</w:t>
+            </w:r>
+            <w:r>
+              <w:t xml:space="preserve"> </w:t>
+            </w:r>
+            <w:r>
+              <w:t xml:space="preserve">and type</w:t>
+            </w:r>
+            <w:r>
+              <w:t xml:space="preserve"> </w:t>
+            </w:r>
+            <w:r>
+              <w:rPr>
+                <w:rStyle w:val="VerbatimChar"/>
+              </w:rPr>
+              <w:t xml:space="preserve">Quarantine</w:t>
+            </w:r>
+            <w:r>
+              <w:t xml:space="preserve"> </w:t>
+            </w:r>
+            <w:r>
+              <w:t xml:space="preserve">or</w:t>
+            </w:r>
+            <w:r>
+              <w:t xml:space="preserve"> </w:t>
+            </w:r>
+            <w:r>
+              <w:rPr>
+                <w:rStyle w:val="VerbatimChar"/>
+              </w:rPr>
+              <w:t xml:space="preserve">Delete</w:t>
+            </w:r>
+            <w:r>
+              <w:t xml:space="preserve">. For any unattended/scheduled run, always pass</w:t>
+            </w:r>
+            <w:r>
+              <w:t xml:space="preserve"> </w:t>
+            </w:r>
+            <w:r>
+              <w:rPr>
+                <w:rStyle w:val="VerbatimChar"/>
+              </w:rPr>
+              <w:t xml:space="preserve">-ActivityType</w:t>
+            </w:r>
+            <w:r>
+              <w:t xml:space="preserve"> </w:t>
+            </w:r>
+            <w:r>
+              <w:t xml:space="preserve">explicitly so there’s no prompt to wait on.</w:t>
             </w:r>
           </w:p>
         </w:tc>
@@ -4532,29 +4816,29 @@
               <w:pStyle w:val="Compact"/>
             </w:pPr>
             <w:r>
-              <w:t xml:space="preserve">Prompted if omitted</w:t>
-            </w:r>
-          </w:p>
-        </w:tc>
-        <w:tc>
-          <w:tcPr/>
-          <w:p>
-            <w:pPr>
-              <w:pStyle w:val="Compact"/>
-            </w:pPr>
-            <w:r>
-              <w:t xml:space="preserve">—</w:t>
-            </w:r>
-          </w:p>
-        </w:tc>
-        <w:tc>
-          <w:tcPr/>
-          <w:p>
-            <w:pPr>
-              <w:pStyle w:val="Compact"/>
-            </w:pPr>
-            <w:r>
-              <w:t xml:space="preserve">Scopes rows and anchors quarantine’s relative paths</w:t>
+              <w:t xml:space="preserve">No (never prompted)</w:t>
+            </w:r>
+          </w:p>
+        </w:tc>
+        <w:tc>
+          <w:tcPr/>
+          <w:p>
+            <w:pPr>
+              <w:pStyle w:val="Compact"/>
+            </w:pPr>
+            <w:r>
+              <w:t xml:space="preserve">none — each row anchors to its own share/drive root</w:t>
+            </w:r>
+          </w:p>
+        </w:tc>
+        <w:tc>
+          <w:tcPr/>
+          <w:p>
+            <w:pPr>
+              <w:pStyle w:val="Compact"/>
+            </w:pPr>
+            <w:r>
+              <w:t xml:space="preserve">Optional safety-net scope filter + common quarantine anchor</w:t>
             </w:r>
           </w:p>
         </w:tc>

</xml_diff>

<commit_message>
Add self-diagnosing hint for mapped-drive-vs-elevation path errors
A common real-world gotcha: a mapped network drive (I:\...) is visible in
Windows Explorer but Test-Path fails for it in PowerShell, because mapped
drives aren't shared between an elevated ("Run as Administrator") session
and a normal one. Read-RequiredPath now detects when a failed path looks
like a drive letter and prints this explanation plus the fix (match
elevation levels, or use the full \\server\share\... path instead, which
works regardless of elevation) rather than just "couldn't find that
path." Verified the hint fires correctly with a piped-input test.
Documented the same scenario in the runbook's troubleshooting table.

Co-Authored-By: Claude Sonnet 5 <noreply@anthropic.com>
</commit_message>
<xml_diff>
--- a/FileShareCleanup-Governed/Runbook.docx
+++ b/FileShareCleanup-Governed/Runbook.docx
@@ -5035,6 +5035,81 @@
             </w:r>
             <w:r>
               <w:t xml:space="preserve">, depending on the script) — retype it exactly as shown on screen.</w:t>
+            </w:r>
+          </w:p>
+        </w:tc>
+      </w:tr>
+      <w:tr>
+        <w:tc>
+          <w:tcPr/>
+          <w:p>
+            <w:pPr>
+              <w:pStyle w:val="Compact"/>
+            </w:pPr>
+            <w:r>
+              <w:t xml:space="preserve">A mapped network drive (e.g. </w:t>
+            </w:r>
+            <w:r>
+              <w:rPr>
+                <w:rStyle w:val="VerbatimChar"/>
+              </w:rPr>
+              <w:t xml:space="preserve">I:\...</w:t>
+            </w:r>
+            <w:r>
+              <w:t xml:space="preserve">) shows fine in Windows Explorer but the script says the path doesn’t exist</w:t>
+            </w:r>
+          </w:p>
+        </w:tc>
+        <w:tc>
+          <w:tcPr/>
+          <w:p>
+            <w:pPr>
+              <w:pStyle w:val="Compact"/>
+            </w:pPr>
+            <w:r>
+              <w:t xml:space="preserve">Mapped drives aren’t shared between an elevated (</w:t>
+            </w:r>
+            <w:r>
+              <w:t xml:space="preserve">“Run as Administrator”</w:t>
+            </w:r>
+            <w:r>
+              <w:t xml:space="preserve">) PowerShell session and a normal one — this is a Windows thing, not a bug. Confirm by opening a plain (non-elevated) PowerShell and running</w:t>
+            </w:r>
+            <w:r>
+              <w:t xml:space="preserve"> </w:t>
+            </w:r>
+            <w:r>
+              <w:rPr>
+                <w:rStyle w:val="VerbatimChar"/>
+              </w:rPr>
+              <w:t xml:space="preserve">Test-Path "I:\..."</w:t>
+            </w:r>
+            <w:r>
+              <w:t xml:space="preserve">; if that comes back</w:t>
+            </w:r>
+            <w:r>
+              <w:t xml:space="preserve"> </w:t>
+            </w:r>
+            <w:r>
+              <w:rPr>
+                <w:rStyle w:val="VerbatimChar"/>
+              </w:rPr>
+              <w:t xml:space="preserve">True</w:t>
+            </w:r>
+            <w:r>
+              <w:t xml:space="preserve"> </w:t>
+            </w:r>
+            <w:r>
+              <w:t xml:space="preserve">but the script still can’t find it, you’re running the script in a different elevation level than whatever mapped the drive. Either run PowerShell the same way (elevated/not) you mapped the drive in, or — more robust — skip the drive letter entirely and type the full network path instead (</w:t>
+            </w:r>
+            <w:r>
+              <w:rPr>
+                <w:rStyle w:val="VerbatimChar"/>
+              </w:rPr>
+              <w:t xml:space="preserve">\\servername\share\...</w:t>
+            </w:r>
+            <w:r>
+              <w:t xml:space="preserve">), which works regardless of elevation. The script prints this same hint automatically if a drive-letter path you enter can’t be found.</w:t>
             </w:r>
           </w:p>
         </w:tc>

</xml_diff>